<commit_message>
updated html; h2 risk tables; small sensitivity run
</commit_message>
<xml_diff>
--- a/assessment/risk_tables/FinMod_h2_output.docx
+++ b/assessment/risk_tables/FinMod_h2_output.docx
@@ -536,7 +536,7 @@
               <w:jc w:val="center"/>
             </w:pPr>
             <w:r>
-              <w:t xml:space="preserve">100</w:t>
+              <w:t xml:space="preserve">87</w:t>
             </w:r>
           </w:p>
         </w:tc>
@@ -560,7 +560,7 @@
               <w:jc w:val="center"/>
             </w:pPr>
             <w:r>
-              <w:t xml:space="preserve">100</w:t>
+              <w:t xml:space="preserve">45</w:t>
             </w:r>
           </w:p>
         </w:tc>
@@ -584,7 +584,7 @@
               <w:jc w:val="center"/>
             </w:pPr>
             <w:r>
-              <w:t xml:space="preserve">100</w:t>
+              <w:t xml:space="preserve">40</w:t>
             </w:r>
           </w:p>
         </w:tc>
@@ -670,7 +670,7 @@
               <w:jc w:val="center"/>
             </w:pPr>
             <w:r>
-              <w:t xml:space="preserve">100</w:t>
+              <w:t xml:space="preserve">97</w:t>
             </w:r>
           </w:p>
         </w:tc>
@@ -694,7 +694,7 @@
               <w:jc w:val="center"/>
             </w:pPr>
             <w:r>
-              <w:t xml:space="preserve">100</w:t>
+              <w:t xml:space="preserve">96</w:t>
             </w:r>
           </w:p>
         </w:tc>
@@ -756,7 +756,7 @@
               <w:jc w:val="center"/>
             </w:pPr>
             <w:r>
-              <w:t xml:space="preserve">100</w:t>
+              <w:t xml:space="preserve">99</w:t>
             </w:r>
           </w:p>
         </w:tc>
@@ -780,7 +780,7 @@
               <w:jc w:val="center"/>
             </w:pPr>
             <w:r>
-              <w:t xml:space="preserve">100</w:t>
+              <w:t xml:space="preserve">96</w:t>
             </w:r>
           </w:p>
         </w:tc>
@@ -804,7 +804,7 @@
               <w:jc w:val="center"/>
             </w:pPr>
             <w:r>
-              <w:t xml:space="preserve">100</w:t>
+              <w:t xml:space="preserve">93</w:t>
             </w:r>
           </w:p>
         </w:tc>
@@ -866,7 +866,7 @@
               <w:jc w:val="center"/>
             </w:pPr>
             <w:r>
-              <w:t xml:space="preserve">100</w:t>
+              <w:t xml:space="preserve">99</w:t>
             </w:r>
           </w:p>
         </w:tc>
@@ -890,7 +890,7 @@
               <w:jc w:val="center"/>
             </w:pPr>
             <w:r>
-              <w:t xml:space="preserve">100</w:t>
+              <w:t xml:space="preserve">93</w:t>
             </w:r>
           </w:p>
         </w:tc>
@@ -914,7 +914,7 @@
               <w:jc w:val="center"/>
             </w:pPr>
             <w:r>
-              <w:t xml:space="preserve">100</w:t>
+              <w:t xml:space="preserve">91</w:t>
             </w:r>
           </w:p>
         </w:tc>
@@ -1316,7 +1316,7 @@
               <w:jc w:val="center"/>
             </w:pPr>
             <w:r>
-              <w:t xml:space="preserve">0</w:t>
+              <w:t xml:space="preserve">100</w:t>
             </w:r>
           </w:p>
         </w:tc>
@@ -1340,7 +1340,7 @@
               <w:jc w:val="center"/>
             </w:pPr>
             <w:r>
-              <w:t xml:space="preserve">0</w:t>
+              <w:t xml:space="preserve">100</w:t>
             </w:r>
           </w:p>
         </w:tc>
@@ -1364,7 +1364,7 @@
               <w:jc w:val="center"/>
             </w:pPr>
             <w:r>
-              <w:t xml:space="preserve">0</w:t>
+              <w:t xml:space="preserve">99</w:t>
             </w:r>
           </w:p>
         </w:tc>
@@ -1426,7 +1426,7 @@
               <w:jc w:val="center"/>
             </w:pPr>
             <w:r>
-              <w:t xml:space="preserve">0</w:t>
+              <w:t xml:space="preserve">99</w:t>
             </w:r>
           </w:p>
         </w:tc>
@@ -1450,7 +1450,7 @@
               <w:jc w:val="center"/>
             </w:pPr>
             <w:r>
-              <w:t xml:space="preserve">0</w:t>
+              <w:t xml:space="preserve">46</w:t>
             </w:r>
           </w:p>
         </w:tc>
@@ -1536,7 +1536,7 @@
               <w:jc w:val="center"/>
             </w:pPr>
             <w:r>
-              <w:t xml:space="preserve">0</w:t>
+              <w:t xml:space="preserve">99</w:t>
             </w:r>
           </w:p>
         </w:tc>
@@ -1560,7 +1560,7 @@
               <w:jc w:val="center"/>
             </w:pPr>
             <w:r>
-              <w:t xml:space="preserve">0</w:t>
+              <w:t xml:space="preserve">89</w:t>
             </w:r>
           </w:p>
         </w:tc>
@@ -1584,7 +1584,7 @@
               <w:jc w:val="center"/>
             </w:pPr>
             <w:r>
-              <w:t xml:space="preserve">0</w:t>
+              <w:t xml:space="preserve">61</w:t>
             </w:r>
           </w:p>
         </w:tc>
@@ -1646,7 +1646,7 @@
               <w:jc w:val="center"/>
             </w:pPr>
             <w:r>
-              <w:t xml:space="preserve">0</w:t>
+              <w:t xml:space="preserve">99</w:t>
             </w:r>
           </w:p>
         </w:tc>
@@ -1670,7 +1670,7 @@
               <w:jc w:val="center"/>
             </w:pPr>
             <w:r>
-              <w:t xml:space="preserve">0</w:t>
+              <w:t xml:space="preserve">79</w:t>
             </w:r>
           </w:p>
         </w:tc>
@@ -1694,7 +1694,7 @@
               <w:jc w:val="center"/>
             </w:pPr>
             <w:r>
-              <w:t xml:space="preserve">0</w:t>
+              <w:t xml:space="preserve">34</w:t>
             </w:r>
           </w:p>
         </w:tc>
@@ -1756,7 +1756,7 @@
               <w:jc w:val="center"/>
             </w:pPr>
             <w:r>
-              <w:t xml:space="preserve">0</w:t>
+              <w:t xml:space="preserve">99</w:t>
             </w:r>
           </w:p>
         </w:tc>
@@ -1780,7 +1780,7 @@
               <w:jc w:val="center"/>
             </w:pPr>
             <w:r>
-              <w:t xml:space="preserve">0</w:t>
+              <w:t xml:space="preserve">65</w:t>
             </w:r>
           </w:p>
         </w:tc>
@@ -1804,7 +1804,7 @@
               <w:jc w:val="center"/>
             </w:pPr>
             <w:r>
-              <w:t xml:space="preserve">0</w:t>
+              <w:t xml:space="preserve">14</w:t>
             </w:r>
           </w:p>
         </w:tc>

</xml_diff>